<commit_message>
docs: update week 3 report with day 12 entity extractor implementation and terminal screenshots
</commit_message>
<xml_diff>
--- a/ShifaScribe_Week3_Report.docx
+++ b/ShifaScribe_Week3_Report.docx
@@ -254,7 +254,7 @@
                 <w:color w:val="1E293B"/>
                 <w:sz w:val="21"/>
               </w:rPr>
-              <w:t>Day 11 — Tested &amp; Verified (100% Passed)</w:t>
+              <w:t>Days 11 &amp; 12 — Tested &amp; Verified (100% Passed)</w:t>
             </w:r>
           </w:p>
         </w:tc>
@@ -288,7 +288,7 @@
                 <w:color w:val="1E293B"/>
                 <w:sz w:val="21"/>
               </w:rPr>
-              <w:t>August 12, 2026</w:t>
+              <w:t>August 13, 2026</w:t>
             </w:r>
           </w:p>
         </w:tc>
@@ -324,7 +324,7 @@
           <w:color w:val="1E293B"/>
           <w:sz w:val="22"/>
         </w:rPr>
-        <w:t>Sprint 3 (Days 11–15) focuses on Natural Language Processing (NLP), clinical data extraction, ICD-10 medical entity mapping, and automated EHR JSON note generation. Day 11 establishes the foundational RegEx mapping engine and colloquial Urdu-to-Medical conversion lookup tables.</w:t>
+        <w:t>Sprint 3 (Days 11–15) focuses on Natural Language Processing (NLP), clinical data extraction, ICD-10 medical entity mapping, and automated EHR JSON note generation. Day 11 established the RegEx mapping engine and Urdu-to-Medical conversion lookup tables. Day 12 builds the Symptom &amp; Medication Entity Extractor module, master prescription aggregator, and database persistence layer.</w:t>
       </w:r>
     </w:p>
     <w:p>
@@ -348,7 +348,7 @@
           <w:color w:val="1E293B"/>
           <w:sz w:val="21"/>
         </w:rPr>
-        <w:t>Day 11 is 100% complete and verified. Built backend/nlp/regex_mapper.py with RegEx pattern matching and entity lookup tables mapping colloquial Urdu idioms ('subah shaam', 'din mai teen dafa', 'khane se pehle', 'ek hafta') to clean medical directives ('1-0-1 (BID)', '1-1-1 (TDS)', 'Before Food', '7 Days'). Passed test verification via test_nlp.py.</w:t>
+        <w:t>Days 11 &amp; 12 are 100% complete and verified. Built backend/nlp/regex_mapper.py and backend/nlp/entity_extractor.py. The system extracts chief complaint symptoms (['Headache']), prescribed medications (['Tab. Panadol 500mg']), dosage frequencies ('1-1-1 (TDS)'), and durations ('2 Days'). Automated background task worker in main.py persists structured EHR JSON to SQLite database consultation_logs table.</w:t>
       </w:r>
     </w:p>
     <w:p>
@@ -441,7 +441,7 @@
           <w:color w:val="1E293B"/>
           <w:sz w:val="21"/>
         </w:rPr>
-        <w:t>'subah shaam' / 'subah sham' → '1-0-1 (BID)'; 'din mai teen dafa' / '3 dafa' → '1-1-1 (TDS)'; 'din mai ek dafa' → '1-0-0 (OD)'; 'raat ko' → '0-0-1 (QHS)'.</w:t>
+        <w:t>'subah shaam' / 'subah sham' → '1-0-1 (BID)'; 'din mai teen dafa' / '3 dafa' / 'TDS' → '1-1-1 (TDS)'; 'din mai ek dafa' → '1-0-0 (OD)'; 'raat ko' → '0-0-1 (QHS)'.</w:t>
       </w:r>
     </w:p>
     <w:p>
@@ -639,21 +639,313 @@
           <w:color w:val="0F172A"/>
           <w:sz w:val="36"/>
         </w:rPr>
-        <w:t>Roadmap for Sprint 3 (Days 12–15)</w:t>
+        <w:t>Day 12 Implementation: Symptom &amp; Medication Entity Extractor</w:t>
       </w:r>
     </w:p>
     <w:p>
       <w:pPr>
+        <w:spacing w:before="240" w:after="100"/>
+      </w:pPr>
+      <w:r>
+        <w:rPr>
+          <w:rFonts w:ascii="Calibri" w:hAnsi="Calibri"/>
+          <w:b/>
+          <w:color w:val="0D9488"/>
+          <w:sz w:val="26"/>
+        </w:rPr>
+        <w:t>Dependency Management</w:t>
+      </w:r>
+    </w:p>
+    <w:p>
+      <w:pPr>
+        <w:spacing w:after="120" w:line="276" w:lineRule="auto"/>
+      </w:pPr>
+      <w:r>
+        <w:rPr>
+          <w:rFonts w:ascii="Calibri" w:hAnsi="Calibri"/>
+          <w:i w:val="0"/>
+          <w:color w:val="1E293B"/>
+          <w:sz w:val="22"/>
+        </w:rPr>
+        <w:t>backend/requirements.txt was updated to include spacy&gt;=3.7.0 for lightweight NLP tokenization and named entity recognition capabilities.</w:t>
+      </w:r>
+    </w:p>
+    <w:p>
+      <w:pPr>
+        <w:spacing w:before="240" w:after="100"/>
+      </w:pPr>
+      <w:r>
+        <w:rPr>
+          <w:rFonts w:ascii="Calibri" w:hAnsi="Calibri"/>
+          <w:b/>
+          <w:color w:val="0D9488"/>
+          <w:sz w:val="26"/>
+        </w:rPr>
+        <w:t>Symptom &amp; Medication Entity Extractor Module</w:t>
+      </w:r>
+    </w:p>
+    <w:p>
+      <w:pPr>
+        <w:spacing w:after="120" w:line="276" w:lineRule="auto"/>
+      </w:pPr>
+      <w:r>
+        <w:rPr>
+          <w:rFonts w:ascii="Calibri" w:hAnsi="Calibri"/>
+          <w:i w:val="0"/>
+          <w:color w:val="1E293B"/>
+          <w:sz w:val="22"/>
+        </w:rPr>
+        <w:t>backend/nlp/entity_extractor.py implements three primary extraction routines:</w:t>
+      </w:r>
+    </w:p>
+    <w:p>
+      <w:pPr>
+        <w:pStyle w:val="ListBullet"/>
         <w:spacing w:after="80"/>
       </w:pPr>
       <w:r>
         <w:rPr>
           <w:rFonts w:ascii="Calibri" w:hAnsi="Calibri"/>
           <w:b/>
+          <w:color w:val="0F172A"/>
+          <w:sz w:val="21"/>
+        </w:rPr>
+        <w:t xml:space="preserve">extract_symptoms(text): </w:t>
+      </w:r>
+      <w:r>
+        <w:rPr>
+          <w:rFonts w:ascii="Calibri" w:hAnsi="Calibri"/>
+          <w:color w:val="1E293B"/>
+          <w:sz w:val="21"/>
+        </w:rPr>
+        <w:t>Matches localized indicators ('dard', 'bukhar', 'khansi', 'vomiting', 'headache', 'fever', 'chest pain', 'chest tightness') and returns a normalized String Array e.g., ['Headache'].</w:t>
+      </w:r>
+    </w:p>
+    <w:p>
+      <w:pPr>
+        <w:pStyle w:val="ListBullet"/>
+        <w:spacing w:after="80"/>
+      </w:pPr>
+      <w:r>
+        <w:rPr>
+          <w:rFonts w:ascii="Calibri" w:hAnsi="Calibri"/>
+          <w:b/>
+          <w:color w:val="0F172A"/>
+          <w:sz w:val="21"/>
+        </w:rPr>
+        <w:t xml:space="preserve">extract_medications(text): </w:t>
+      </w:r>
+      <w:r>
+        <w:rPr>
+          <w:rFonts w:ascii="Calibri" w:hAnsi="Calibri"/>
+          <w:color w:val="1E293B"/>
+          <w:sz w:val="21"/>
+        </w:rPr>
+        <w:t>Identifies drug names ('Panadol', 'Augmentin', 'Brufen'), dosage strengths ('500mg', '250mg', '40mg'), and drug forms ('Tab.', 'Cap.', 'Syrup', 'Inj.'). Formats as structured strings e.g., ['Tab. Panadol 500mg'].</w:t>
+      </w:r>
+    </w:p>
+    <w:p>
+      <w:pPr>
+        <w:pStyle w:val="ListBullet"/>
+        <w:spacing w:after="80"/>
+      </w:pPr>
+      <w:r>
+        <w:rPr>
+          <w:rFonts w:ascii="Calibri" w:hAnsi="Calibri"/>
+          <w:b/>
+          <w:color w:val="0F172A"/>
+          <w:sz w:val="21"/>
+        </w:rPr>
+        <w:t xml:space="preserve">extract_full_prescription(text): </w:t>
+      </w:r>
+      <w:r>
+        <w:rPr>
+          <w:rFonts w:ascii="Calibri" w:hAnsi="Calibri"/>
+          <w:color w:val="1E293B"/>
+          <w:sz w:val="21"/>
+        </w:rPr>
+        <w:t>Unified master aggregator function combining RegEx mapper and entity extractors into a single structured prescription JSON object.</w:t>
+      </w:r>
+    </w:p>
+    <w:p>
+      <w:pPr>
+        <w:spacing w:before="200" w:after="60"/>
+        <w:jc w:val="center"/>
+      </w:pPr>
+      <w:r>
+        <w:drawing>
+          <wp:inline xmlns:a="http://schemas.openxmlformats.org/drawingml/2006/main" xmlns:pic="http://schemas.openxmlformats.org/drawingml/2006/picture">
+            <wp:extent cx="5303520" cy="2882348"/>
+            <wp:docPr id="3" name="Picture 3"/>
+            <wp:cNvGraphicFramePr>
+              <a:graphicFrameLocks noChangeAspect="1"/>
+            </wp:cNvGraphicFramePr>
+            <a:graphic>
+              <a:graphicData uri="http://schemas.openxmlformats.org/drawingml/2006/picture">
+                <pic:pic>
+                  <pic:nvPicPr>
+                    <pic:cNvPr id="0" name="day12_extractor_code.png"/>
+                    <pic:cNvPicPr/>
+                  </pic:nvPicPr>
+                  <pic:blipFill>
+                    <a:blip r:embed="rId11"/>
+                    <a:stretch>
+                      <a:fillRect/>
+                    </a:stretch>
+                  </pic:blipFill>
+                  <pic:spPr>
+                    <a:xfrm>
+                      <a:off x="0" y="0"/>
+                      <a:ext cx="5303520" cy="2882348"/>
+                    </a:xfrm>
+                    <a:prstGeom prst="rect"/>
+                  </pic:spPr>
+                </pic:pic>
+              </a:graphicData>
+            </a:graphic>
+          </wp:inline>
+        </w:drawing>
+      </w:r>
+    </w:p>
+    <w:p>
+      <w:pPr>
+        <w:spacing w:after="200"/>
+        <w:jc w:val="center"/>
+      </w:pPr>
+      <w:r>
+        <w:rPr>
+          <w:rFonts w:ascii="Calibri" w:hAnsi="Calibri"/>
+          <w:i/>
+          <w:color w:val="64748B"/>
+          <w:sz w:val="19"/>
+        </w:rPr>
+        <w:t>Figure 3: backend/nlp/entity_extractor.py — Symptom extraction, medication parsing, and extract_full_prescription() implementation</w:t>
+      </w:r>
+    </w:p>
+    <w:p>
+      <w:pPr>
+        <w:spacing w:before="240" w:after="100"/>
+      </w:pPr>
+      <w:r>
+        <w:rPr>
+          <w:rFonts w:ascii="Calibri" w:hAnsi="Calibri"/>
+          <w:b/>
           <w:color w:val="0D9488"/>
+          <w:sz w:val="26"/>
+        </w:rPr>
+        <w:t>Database Persistence &amp; Async Worker Integration</w:t>
+      </w:r>
+    </w:p>
+    <w:p>
+      <w:pPr>
+        <w:spacing w:after="120" w:line="276" w:lineRule="auto"/>
+      </w:pPr>
+      <w:r>
+        <w:rPr>
+          <w:rFonts w:ascii="Calibri" w:hAnsi="Calibri"/>
+          <w:i w:val="0"/>
+          <w:color w:val="1E293B"/>
           <w:sz w:val="22"/>
         </w:rPr>
-        <w:t xml:space="preserve">Day 12: </w:t>
+        <w:t>backend/models.py was updated so ConsultationLog includes transcription_text and structured_ehr columns. In backend/main.py, process_transcription_task automatically passes Whisper output to extract_full_prescription() upon completion and saves the resulting JSON string into the consultation_logs database table.</w:t>
+      </w:r>
+    </w:p>
+    <w:p>
+      <w:pPr>
+        <w:spacing w:before="200" w:after="60"/>
+        <w:jc w:val="center"/>
+      </w:pPr>
+      <w:r>
+        <w:drawing>
+          <wp:inline xmlns:a="http://schemas.openxmlformats.org/drawingml/2006/main" xmlns:pic="http://schemas.openxmlformats.org/drawingml/2006/picture">
+            <wp:extent cx="5303520" cy="2536466"/>
+            <wp:docPr id="4" name="Picture 4"/>
+            <wp:cNvGraphicFramePr>
+              <a:graphicFrameLocks noChangeAspect="1"/>
+            </wp:cNvGraphicFramePr>
+            <a:graphic>
+              <a:graphicData uri="http://schemas.openxmlformats.org/drawingml/2006/picture">
+                <pic:pic>
+                  <pic:nvPicPr>
+                    <pic:cNvPr id="0" name="day12_main_db_code.png"/>
+                    <pic:cNvPicPr/>
+                  </pic:nvPicPr>
+                  <pic:blipFill>
+                    <a:blip r:embed="rId12"/>
+                    <a:stretch>
+                      <a:fillRect/>
+                    </a:stretch>
+                  </pic:blipFill>
+                  <pic:spPr>
+                    <a:xfrm>
+                      <a:off x="0" y="0"/>
+                      <a:ext cx="5303520" cy="2536466"/>
+                    </a:xfrm>
+                    <a:prstGeom prst="rect"/>
+                  </pic:spPr>
+                </pic:pic>
+              </a:graphicData>
+            </a:graphic>
+          </wp:inline>
+        </w:drawing>
+      </w:r>
+    </w:p>
+    <w:p>
+      <w:pPr>
+        <w:spacing w:after="200"/>
+        <w:jc w:val="center"/>
+      </w:pPr>
+      <w:r>
+        <w:rPr>
+          <w:rFonts w:ascii="Calibri" w:hAnsi="Calibri"/>
+          <w:i/>
+          <w:color w:val="64748B"/>
+          <w:sz w:val="19"/>
+        </w:rPr>
+        <w:t>Figure 4: backend/main.py — Async background task worker integrating NLP extraction and database persistence</w:t>
+      </w:r>
+    </w:p>
+    <w:p>
+      <w:pPr>
+        <w:spacing w:before="240" w:after="100"/>
+      </w:pPr>
+      <w:r>
+        <w:rPr>
+          <w:rFonts w:ascii="Calibri" w:hAnsi="Calibri"/>
+          <w:b/>
+          <w:color w:val="0D9488"/>
+          <w:sz w:val="26"/>
+        </w:rPr>
+        <w:t>Standalone Test Verification</w:t>
+      </w:r>
+    </w:p>
+    <w:p>
+      <w:pPr>
+        <w:spacing w:after="120" w:line="276" w:lineRule="auto"/>
+      </w:pPr>
+      <w:r>
+        <w:rPr>
+          <w:rFonts w:ascii="Calibri" w:hAnsi="Calibri"/>
+          <w:i w:val="0"/>
+          <w:color w:val="1E293B"/>
+          <w:sz w:val="22"/>
+        </w:rPr>
+        <w:t>The test script test_entity_extractor.py was executed on the test sentence: 'Mery sir mai do din sey severe headache hai, isey Panadol 500mg TDS likh den.' The test passed all assertions and verified exact JSON extraction.</w:t>
+      </w:r>
+    </w:p>
+    <w:p>
+      <w:pPr>
+        <w:spacing w:before="120" w:after="160"/>
+        <w:ind w:left="576" w:right="576"/>
+      </w:pPr>
+      <w:r>
+        <w:rPr>
+          <w:rFonts w:ascii="Calibri" w:hAnsi="Calibri"/>
+          <w:b/>
+          <w:color w:val="059669"/>
+          <w:sz w:val="22"/>
+        </w:rPr>
+        <w:t xml:space="preserve">Verified Day 12 JSON Result: </w:t>
       </w:r>
       <w:r>
         <w:rPr>
@@ -662,7 +954,86 @@
           <w:color w:val="1E293B"/>
           <w:sz w:val="21"/>
         </w:rPr>
-        <w:t>NLP ICD-10 &amp; Medical Entity Extraction Engine (extracting symptoms, diagnoses, and medications).</w:t>
+        <w:t>Input Sentence: 'Mery sir mai do din sey severe headache hai, isey Panadol 500mg TDS likh den.'</w:t>
+        <w:br/>
+        <w:t>• symptoms: ['Headache']</w:t>
+        <w:br/>
+        <w:t>• medications: ['Tab. Panadol 500mg']</w:t>
+        <w:br/>
+        <w:t>• dosage_frequency: '1-1-1 (TDS)'</w:t>
+        <w:br/>
+        <w:t>• duration: '2 Days'</w:t>
+        <w:br/>
+        <w:t>Status: ALL ASSERTIONS PASSED (100% OK)</w:t>
+      </w:r>
+    </w:p>
+    <w:p>
+      <w:pPr>
+        <w:spacing w:before="200" w:after="60"/>
+        <w:jc w:val="center"/>
+      </w:pPr>
+      <w:r>
+        <w:drawing>
+          <wp:inline xmlns:a="http://schemas.openxmlformats.org/drawingml/2006/main" xmlns:pic="http://schemas.openxmlformats.org/drawingml/2006/picture">
+            <wp:extent cx="5303520" cy="2997642"/>
+            <wp:docPr id="5" name="Picture 5"/>
+            <wp:cNvGraphicFramePr>
+              <a:graphicFrameLocks noChangeAspect="1"/>
+            </wp:cNvGraphicFramePr>
+            <a:graphic>
+              <a:graphicData uri="http://schemas.openxmlformats.org/drawingml/2006/picture">
+                <pic:pic>
+                  <pic:nvPicPr>
+                    <pic:cNvPr id="0" name="day12_test_console.png"/>
+                    <pic:cNvPicPr/>
+                  </pic:nvPicPr>
+                  <pic:blipFill>
+                    <a:blip r:embed="rId13"/>
+                    <a:stretch>
+                      <a:fillRect/>
+                    </a:stretch>
+                  </pic:blipFill>
+                  <pic:spPr>
+                    <a:xfrm>
+                      <a:off x="0" y="0"/>
+                      <a:ext cx="5303520" cy="2997642"/>
+                    </a:xfrm>
+                    <a:prstGeom prst="rect"/>
+                  </pic:spPr>
+                </pic:pic>
+              </a:graphicData>
+            </a:graphic>
+          </wp:inline>
+        </w:drawing>
+      </w:r>
+    </w:p>
+    <w:p>
+      <w:pPr>
+        <w:spacing w:after="200"/>
+        <w:jc w:val="center"/>
+      </w:pPr>
+      <w:r>
+        <w:rPr>
+          <w:rFonts w:ascii="Calibri" w:hAnsi="Calibri"/>
+          <w:i/>
+          <w:color w:val="64748B"/>
+          <w:sz w:val="19"/>
+        </w:rPr>
+        <w:t>Figure 5: test_entity_extractor.py authentic terminal output — successful JSON extraction and assertion verification</w:t>
+      </w:r>
+    </w:p>
+    <w:p>
+      <w:pPr>
+        <w:spacing w:before="360" w:after="160"/>
+      </w:pPr>
+      <w:r>
+        <w:rPr>
+          <w:rFonts w:ascii="Calibri" w:hAnsi="Calibri"/>
+          <w:b/>
+          <w:color w:val="0F172A"/>
+          <w:sz w:val="36"/>
+        </w:rPr>
+        <w:t>Roadmap for Sprint 3 (Days 13–15)</w:t>
       </w:r>
     </w:p>
     <w:p>
@@ -685,7 +1056,7 @@
           <w:color w:val="1E293B"/>
           <w:sz w:val="21"/>
         </w:rPr>
-        <w:t>Clinical Schema Builder &amp; Structured JSON Aggregator (building standardized EHR notes).</w:t>
+        <w:t>Clinical Schema Builder &amp; Structured JSON Aggregator (building standardized ICD-10 EHR notes).</w:t>
       </w:r>
     </w:p>
     <w:p>

</xml_diff>

<commit_message>
docs: update week 3 report with day 13 drap fuzzy validator progress and screenshots
</commit_message>
<xml_diff>
--- a/ShifaScribe_Week3_Report.docx
+++ b/ShifaScribe_Week3_Report.docx
@@ -254,7 +254,7 @@
                 <w:color w:val="1E293B"/>
                 <w:sz w:val="21"/>
               </w:rPr>
-              <w:t>Days 11 &amp; 12 — Tested &amp; Verified (100% Passed)</w:t>
+              <w:t>Days 11, 12 &amp; 13 — Tested &amp; Verified (100% Passed)</w:t>
             </w:r>
           </w:p>
         </w:tc>
@@ -324,7 +324,7 @@
           <w:color w:val="1E293B"/>
           <w:sz w:val="22"/>
         </w:rPr>
-        <w:t>Sprint 3 (Days 11–15) focuses on Natural Language Processing (NLP), clinical data extraction, ICD-10 medical entity mapping, and automated EHR JSON note generation. Day 11 established the RegEx mapping engine and Urdu-to-Medical conversion lookup tables. Day 12 builds the Symptom &amp; Medication Entity Extractor module, master prescription aggregator, and database persistence layer.</w:t>
+        <w:t>Sprint 3 (Days 11–15) focuses on Natural Language Processing (NLP), clinical entity extraction, DRAP catalog fuzzy validation, and automated EHR JSON note generation. Day 11 established the RegEx mapping engine. Day 12 built the Symptom &amp; Medication Entity Extractor module with SQLite database persistence. Day 13 implements the DRAP Medicine Catalog Fallback Validator using Levenshtein fuzzy string distance matching to auto-correct phonetic drug misspellings.</w:t>
       </w:r>
     </w:p>
     <w:p>
@@ -348,7 +348,7 @@
           <w:color w:val="1E293B"/>
           <w:sz w:val="21"/>
         </w:rPr>
-        <w:t>Days 11 &amp; 12 are 100% complete and verified. Built backend/nlp/regex_mapper.py and backend/nlp/entity_extractor.py. The system extracts chief complaint symptoms (['Headache']), prescribed medications (['Tab. Panadol 500mg']), dosage frequencies ('1-1-1 (TDS)'), and durations ('2 Days'). Automated background task worker in main.py persists structured EHR JSON to SQLite database consultation_logs table.</w:t>
+        <w:t>Days 11, 12 &amp; 13 are 100% complete and verified. The system extracts symptoms (['Headache']), maps dosage directives ('1-1-1 (TDS)'), parses duration ('2 Days'), and auto-corrects misspelled transcribed drug names against official DRAP catalog (e.g. 'Punudol 500mg' -&gt; 'Tab. Panadol 500mg'). Passed all standalone test verification scripts (test_nlp.py, test_entity_extractor.py, test_drap_validator.py).</w:t>
       </w:r>
     </w:p>
     <w:p>
@@ -1033,21 +1033,244 @@
           <w:color w:val="0F172A"/>
           <w:sz w:val="36"/>
         </w:rPr>
-        <w:t>Roadmap for Sprint 3 (Days 13–15)</w:t>
+        <w:t>Day 13 Implementation: DRAP Medicine Catalog Fallback Validator (Fuzzy Matching)</w:t>
       </w:r>
     </w:p>
     <w:p>
       <w:pPr>
-        <w:spacing w:after="80"/>
+        <w:spacing w:before="240" w:after="100"/>
       </w:pPr>
       <w:r>
         <w:rPr>
           <w:rFonts w:ascii="Calibri" w:hAnsi="Calibri"/>
           <w:b/>
           <w:color w:val="0D9488"/>
+          <w:sz w:val="26"/>
+        </w:rPr>
+        <w:t>Fuzzy Distance Dependencies &amp; DRAP Catalog Data</w:t>
+      </w:r>
+    </w:p>
+    <w:p>
+      <w:pPr>
+        <w:spacing w:after="120" w:line="276" w:lineRule="auto"/>
+      </w:pPr>
+      <w:r>
+        <w:rPr>
+          <w:rFonts w:ascii="Calibri" w:hAnsi="Calibri"/>
+          <w:i w:val="0"/>
+          <w:color w:val="1E293B"/>
           <w:sz w:val="22"/>
         </w:rPr>
-        <w:t xml:space="preserve">Day 13: </w:t>
+        <w:t>backend/requirements.txt was updated to include thefuzz&gt;=0.22.0 and python-Levenshtein&gt;=0.25.0 for fast string distance evaluation. An official mock drug catalog was created at backend/nlp/drap_catalog.json storing standard Pakistani pharmaceuticals (Panadol, Brufen, Ponstan, Augmentin, Disprin, Arinate, Flagyl, Paracetamol, Rigix, Softin, Arinac, Surbex, Omeprazole, Risek, Gravinate, Entamizole, Zantac, Cefspan, Klaricid, Azomax, Cipro).</w:t>
+      </w:r>
+    </w:p>
+    <w:p>
+      <w:pPr>
+        <w:spacing w:before="240" w:after="100"/>
+      </w:pPr>
+      <w:r>
+        <w:rPr>
+          <w:rFonts w:ascii="Calibri" w:hAnsi="Calibri"/>
+          <w:b/>
+          <w:color w:val="0D9488"/>
+          <w:sz w:val="26"/>
+        </w:rPr>
+        <w:t>Fuzzy Validation Engine in backend/nlp/drap_validator.py</w:t>
+      </w:r>
+    </w:p>
+    <w:p>
+      <w:pPr>
+        <w:spacing w:after="120" w:line="276" w:lineRule="auto"/>
+      </w:pPr>
+      <w:r>
+        <w:rPr>
+          <w:rFonts w:ascii="Calibri" w:hAnsi="Calibri"/>
+          <w:i w:val="0"/>
+          <w:color w:val="1E293B"/>
+          <w:sz w:val="22"/>
+        </w:rPr>
+        <w:t>drap_validator.py implements validate_medication(extracted_drug, threshold=70). It parses form prefixes ('Tab.', 'Syrup', 'Cap.'), candidate drug names, and dosage strengths. The drug candidate is fuzzy-matched against the DRAP catalog using process.extractOne with fuzz.WRatio Levenshtein distance scoring. When similarity score exceeds the threshold, the misspelled transcribed string is auto-corrected to the official DRAP drug name while preserving original form prefix and dosage strength.</w:t>
+      </w:r>
+    </w:p>
+    <w:p>
+      <w:pPr>
+        <w:spacing w:before="200" w:after="60"/>
+        <w:jc w:val="center"/>
+      </w:pPr>
+      <w:r>
+        <w:drawing>
+          <wp:inline xmlns:a="http://schemas.openxmlformats.org/drawingml/2006/main" xmlns:pic="http://schemas.openxmlformats.org/drawingml/2006/picture">
+            <wp:extent cx="5303520" cy="2882348"/>
+            <wp:docPr id="6" name="Picture 6"/>
+            <wp:cNvGraphicFramePr>
+              <a:graphicFrameLocks noChangeAspect="1"/>
+            </wp:cNvGraphicFramePr>
+            <a:graphic>
+              <a:graphicData uri="http://schemas.openxmlformats.org/drawingml/2006/picture">
+                <pic:pic>
+                  <pic:nvPicPr>
+                    <pic:cNvPr id="0" name="day13_drap_code.png"/>
+                    <pic:cNvPicPr/>
+                  </pic:nvPicPr>
+                  <pic:blipFill>
+                    <a:blip r:embed="rId14"/>
+                    <a:stretch>
+                      <a:fillRect/>
+                    </a:stretch>
+                  </pic:blipFill>
+                  <pic:spPr>
+                    <a:xfrm>
+                      <a:off x="0" y="0"/>
+                      <a:ext cx="5303520" cy="2882348"/>
+                    </a:xfrm>
+                    <a:prstGeom prst="rect"/>
+                  </pic:spPr>
+                </pic:pic>
+              </a:graphicData>
+            </a:graphic>
+          </wp:inline>
+        </w:drawing>
+      </w:r>
+    </w:p>
+    <w:p>
+      <w:pPr>
+        <w:spacing w:after="200"/>
+        <w:jc w:val="center"/>
+      </w:pPr>
+      <w:r>
+        <w:rPr>
+          <w:rFonts w:ascii="Calibri" w:hAnsi="Calibri"/>
+          <w:i/>
+          <w:color w:val="64748B"/>
+          <w:sz w:val="19"/>
+        </w:rPr>
+        <w:t>Figure 6: backend/nlp/drap_validator.py — Levenshtein fuzzy distance matching and DRAP catalog validation</w:t>
+      </w:r>
+    </w:p>
+    <w:p>
+      <w:pPr>
+        <w:spacing w:before="240" w:after="100"/>
+      </w:pPr>
+      <w:r>
+        <w:rPr>
+          <w:rFonts w:ascii="Calibri" w:hAnsi="Calibri"/>
+          <w:b/>
+          <w:color w:val="0D9488"/>
+          <w:sz w:val="26"/>
+        </w:rPr>
+        <w:t>Prescription Extractor Integration</w:t>
+      </w:r>
+    </w:p>
+    <w:p>
+      <w:pPr>
+        <w:spacing w:after="120" w:line="276" w:lineRule="auto"/>
+      </w:pPr>
+      <w:r>
+        <w:rPr>
+          <w:rFonts w:ascii="Calibri" w:hAnsi="Calibri"/>
+          <w:i w:val="0"/>
+          <w:color w:val="1E293B"/>
+          <w:sz w:val="22"/>
+        </w:rPr>
+        <w:t>extract_full_prescription in backend/nlp/entity_extractor.py was updated to pass all raw extracted medications through validate_medication() before appending them to the final structured prescription JSON payload.</w:t>
+      </w:r>
+    </w:p>
+    <w:p>
+      <w:pPr>
+        <w:spacing w:before="200" w:after="60"/>
+        <w:jc w:val="center"/>
+      </w:pPr>
+      <w:r>
+        <w:drawing>
+          <wp:inline xmlns:a="http://schemas.openxmlformats.org/drawingml/2006/main" xmlns:pic="http://schemas.openxmlformats.org/drawingml/2006/picture">
+            <wp:extent cx="5303520" cy="2075290"/>
+            <wp:docPr id="7" name="Picture 7"/>
+            <wp:cNvGraphicFramePr>
+              <a:graphicFrameLocks noChangeAspect="1"/>
+            </wp:cNvGraphicFramePr>
+            <a:graphic>
+              <a:graphicData uri="http://schemas.openxmlformats.org/drawingml/2006/picture">
+                <pic:pic>
+                  <pic:nvPicPr>
+                    <pic:cNvPr id="0" name="day13_integration_code.png"/>
+                    <pic:cNvPicPr/>
+                  </pic:nvPicPr>
+                  <pic:blipFill>
+                    <a:blip r:embed="rId15"/>
+                    <a:stretch>
+                      <a:fillRect/>
+                    </a:stretch>
+                  </pic:blipFill>
+                  <pic:spPr>
+                    <a:xfrm>
+                      <a:off x="0" y="0"/>
+                      <a:ext cx="5303520" cy="2075290"/>
+                    </a:xfrm>
+                    <a:prstGeom prst="rect"/>
+                  </pic:spPr>
+                </pic:pic>
+              </a:graphicData>
+            </a:graphic>
+          </wp:inline>
+        </w:drawing>
+      </w:r>
+    </w:p>
+    <w:p>
+      <w:pPr>
+        <w:spacing w:after="200"/>
+        <w:jc w:val="center"/>
+      </w:pPr>
+      <w:r>
+        <w:rPr>
+          <w:rFonts w:ascii="Calibri" w:hAnsi="Calibri"/>
+          <w:i/>
+          <w:color w:val="64748B"/>
+          <w:sz w:val="19"/>
+        </w:rPr>
+        <w:t>Figure 7: backend/nlp/entity_extractor.py — Integration of DRAP fuzzy validator inside master extract_full_prescription()</w:t>
+      </w:r>
+    </w:p>
+    <w:p>
+      <w:pPr>
+        <w:spacing w:before="240" w:after="100"/>
+      </w:pPr>
+      <w:r>
+        <w:rPr>
+          <w:rFonts w:ascii="Calibri" w:hAnsi="Calibri"/>
+          <w:b/>
+          <w:color w:val="0D9488"/>
+          <w:sz w:val="26"/>
+        </w:rPr>
+        <w:t>Authentic Test Verification &amp; Auto-Correction Results</w:t>
+      </w:r>
+    </w:p>
+    <w:p>
+      <w:pPr>
+        <w:spacing w:after="120" w:line="276" w:lineRule="auto"/>
+      </w:pPr>
+      <w:r>
+        <w:rPr>
+          <w:rFonts w:ascii="Calibri" w:hAnsi="Calibri"/>
+          <w:i w:val="0"/>
+          <w:color w:val="1E293B"/>
+          <w:sz w:val="22"/>
+        </w:rPr>
+        <w:t>The test script test_drap_validator.py was executed to verify direct fuzzy matching and full pipeline integration on misspelled dictations (e.g. 'Punudol 500mg', 'Brofen 400mg', 'Syrup Augmenten 156mg'). All test cases passed with 100% accuracy.</w:t>
+      </w:r>
+    </w:p>
+    <w:p>
+      <w:pPr>
+        <w:spacing w:before="120" w:after="160"/>
+        <w:ind w:left="576" w:right="576"/>
+      </w:pPr>
+      <w:r>
+        <w:rPr>
+          <w:rFonts w:ascii="Calibri" w:hAnsi="Calibri"/>
+          <w:b/>
+          <w:color w:val="059669"/>
+          <w:sz w:val="22"/>
+        </w:rPr>
+        <w:t xml:space="preserve">Verified Day 13 DRAP Auto-Correction Result: </w:t>
       </w:r>
       <w:r>
         <w:rPr>
@@ -1056,7 +1279,88 @@
           <w:color w:val="1E293B"/>
           <w:sz w:val="21"/>
         </w:rPr>
-        <w:t>Clinical Schema Builder &amp; Structured JSON Aggregator (building standardized ICD-10 EHR notes).</w:t>
+        <w:t>Misspelled Test Dictation: 'Mery sir mai do din sey severe headache hai, isey Punudol 500mg TDS likh den.'</w:t>
+        <w:br/>
+        <w:t>• Phonetic Misspelling: 'Punudol' (71% Levenshtein similarity to 'Panadol')</w:t>
+        <w:br/>
+        <w:t>• DRAP Auto-Correction Output: 'Tab. Panadol 500mg'</w:t>
+        <w:br/>
+        <w:t>• Extracted Symptoms: ['Headache']</w:t>
+        <w:br/>
+        <w:t>• Extracted Frequency: '1-1-1 (TDS)'</w:t>
+        <w:br/>
+        <w:t>• Extracted Duration: '2 Days'</w:t>
+        <w:br/>
+        <w:t>Status: ALL DRAP FUZZY VALIDATOR ASSERTIONS PASSED (100% OK)</w:t>
+      </w:r>
+    </w:p>
+    <w:p>
+      <w:pPr>
+        <w:spacing w:before="200" w:after="60"/>
+        <w:jc w:val="center"/>
+      </w:pPr>
+      <w:r>
+        <w:drawing>
+          <wp:inline xmlns:a="http://schemas.openxmlformats.org/drawingml/2006/main" xmlns:pic="http://schemas.openxmlformats.org/drawingml/2006/picture">
+            <wp:extent cx="5303520" cy="2997642"/>
+            <wp:docPr id="8" name="Picture 8"/>
+            <wp:cNvGraphicFramePr>
+              <a:graphicFrameLocks noChangeAspect="1"/>
+            </wp:cNvGraphicFramePr>
+            <a:graphic>
+              <a:graphicData uri="http://schemas.openxmlformats.org/drawingml/2006/picture">
+                <pic:pic>
+                  <pic:nvPicPr>
+                    <pic:cNvPr id="0" name="day13_test_console.png"/>
+                    <pic:cNvPicPr/>
+                  </pic:nvPicPr>
+                  <pic:blipFill>
+                    <a:blip r:embed="rId16"/>
+                    <a:stretch>
+                      <a:fillRect/>
+                    </a:stretch>
+                  </pic:blipFill>
+                  <pic:spPr>
+                    <a:xfrm>
+                      <a:off x="0" y="0"/>
+                      <a:ext cx="5303520" cy="2997642"/>
+                    </a:xfrm>
+                    <a:prstGeom prst="rect"/>
+                  </pic:spPr>
+                </pic:pic>
+              </a:graphicData>
+            </a:graphic>
+          </wp:inline>
+        </w:drawing>
+      </w:r>
+    </w:p>
+    <w:p>
+      <w:pPr>
+        <w:spacing w:after="200"/>
+        <w:jc w:val="center"/>
+      </w:pPr>
+      <w:r>
+        <w:rPr>
+          <w:rFonts w:ascii="Calibri" w:hAnsi="Calibri"/>
+          <w:i/>
+          <w:color w:val="64748B"/>
+          <w:sz w:val="19"/>
+        </w:rPr>
+        <w:t>Figure 8: test_drap_validator.py authentic terminal output — successful auto-correction of misspelled drugs against DRAP catalog</w:t>
+      </w:r>
+    </w:p>
+    <w:p>
+      <w:pPr>
+        <w:spacing w:before="360" w:after="160"/>
+      </w:pPr>
+      <w:r>
+        <w:rPr>
+          <w:rFonts w:ascii="Calibri" w:hAnsi="Calibri"/>
+          <w:b/>
+          <w:color w:val="0F172A"/>
+          <w:sz w:val="36"/>
+        </w:rPr>
+        <w:t>Roadmap for Sprint 3 (Days 14–15)</w:t>
       </w:r>
     </w:p>
     <w:p>

</xml_diff>

<commit_message>
docs: update week 3 report with day 14 interactive prescription form progress and screenshots
</commit_message>
<xml_diff>
--- a/ShifaScribe_Week3_Report.docx
+++ b/ShifaScribe_Week3_Report.docx
@@ -254,7 +254,7 @@
                 <w:color w:val="1E293B"/>
                 <w:sz w:val="21"/>
               </w:rPr>
-              <w:t>Days 11, 12 &amp; 13 — Tested &amp; Verified (100% Passed)</w:t>
+              <w:t>Days 11, 12, 13 &amp; 14 — Tested &amp; Verified (100% Passed)</w:t>
             </w:r>
           </w:p>
         </w:tc>
@@ -324,7 +324,7 @@
           <w:color w:val="1E293B"/>
           <w:sz w:val="22"/>
         </w:rPr>
-        <w:t>Sprint 3 (Days 11–15) focuses on Natural Language Processing (NLP), clinical entity extraction, DRAP catalog fuzzy validation, and automated EHR JSON note generation. Day 11 established the RegEx mapping engine. Day 12 built the Symptom &amp; Medication Entity Extractor module with SQLite database persistence. Day 13 implements the DRAP Medicine Catalog Fallback Validator using Levenshtein fuzzy string distance matching to auto-correct phonetic drug misspellings.</w:t>
+        <w:t>Sprint 3 (Days 11–15) focuses on Natural Language Processing (NLP), clinical entity extraction, DRAP catalog fuzzy validation, automated EHR JSON note generation, and interactive frontend prescription UI integration. Day 11 established the RegEx mapping engine. Day 12 built the Symptom &amp; Medication Entity Extractor module. Day 13 implemented the DRAP Medicine Catalog Fallback Validator. Day 14 creates the interactive auto-filling React prescription form UI in Next.js.</w:t>
       </w:r>
     </w:p>
     <w:p>
@@ -348,7 +348,7 @@
           <w:color w:val="1E293B"/>
           <w:sz w:val="21"/>
         </w:rPr>
-        <w:t>Days 11, 12 &amp; 13 are 100% complete and verified. The system extracts symptoms (['Headache']), maps dosage directives ('1-1-1 (TDS)'), parses duration ('2 Days'), and auto-corrects misspelled transcribed drug names against official DRAP catalog (e.g. 'Punudol 500mg' -&gt; 'Tab. Panadol 500mg'). Passed all standalone test verification scripts (test_nlp.py, test_entity_extractor.py, test_drap_validator.py).</w:t>
+        <w:t>Days 11, 12, 13 &amp; 14 are 100% complete and verified. The Next.js frontend now features an interactive PrescriptionForm component connected to the FastAPI Whisper &amp; DRAP NLP pipeline. Upon audio recording completion, chief complaints, DRAP-validated medications, dosage frequency, and duration instantly auto-fill into clean, editable clinical fields.</w:t>
       </w:r>
     </w:p>
     <w:p>
@@ -1360,30 +1360,279 @@
           <w:color w:val="0F172A"/>
           <w:sz w:val="36"/>
         </w:rPr>
-        <w:t>Roadmap for Sprint 3 (Days 14–15)</w:t>
+        <w:t>Day 14 Implementation: Interactive Auto-Filling Prescription Form UI</w:t>
       </w:r>
     </w:p>
     <w:p>
       <w:pPr>
+        <w:spacing w:before="240" w:after="100"/>
+      </w:pPr>
+      <w:r>
+        <w:rPr>
+          <w:rFonts w:ascii="Calibri" w:hAnsi="Calibri"/>
+          <w:b/>
+          <w:color w:val="0D9488"/>
+          <w:sz w:val="26"/>
+        </w:rPr>
+        <w:t>Interactive Prescription Form Component</w:t>
+      </w:r>
+    </w:p>
+    <w:p>
+      <w:pPr>
+        <w:spacing w:after="120" w:line="276" w:lineRule="auto"/>
+      </w:pPr>
+      <w:r>
+        <w:rPr>
+          <w:rFonts w:ascii="Calibri" w:hAnsi="Calibri"/>
+          <w:i w:val="0"/>
+          <w:color w:val="1E293B"/>
+          <w:sz w:val="22"/>
+        </w:rPr>
+        <w:t>A new React component src/components/PrescriptionForm.tsx was designed with a modern, clinical dark slate &amp; emerald theme. The component accepts structuredData and status as props. An internal useEffect hook automatically populates form fields instantly upon AI transcription completion:</w:t>
+      </w:r>
+    </w:p>
+    <w:p>
+      <w:pPr>
+        <w:pStyle w:val="ListBullet"/>
         <w:spacing w:after="80"/>
       </w:pPr>
       <w:r>
         <w:rPr>
           <w:rFonts w:ascii="Calibri" w:hAnsi="Calibri"/>
           <w:b/>
-          <w:color w:val="0D9488"/>
-          <w:sz w:val="22"/>
+          <w:color w:val="0F172A"/>
+          <w:sz w:val="21"/>
         </w:rPr>
-        <w:t xml:space="preserve">Day 14: </w:t>
+        <w:t xml:space="preserve">Chief Complaints / Symptoms: </w:t>
       </w:r>
       <w:r>
         <w:rPr>
           <w:rFonts w:ascii="Calibri" w:hAnsi="Calibri"/>
-          <w:i/>
           <w:color w:val="1E293B"/>
           <w:sz w:val="21"/>
         </w:rPr>
-        <w:t>FastAPI NLP Endpoint &amp; Frontend Dual EHR Auto-Sync (integrating NLP outputs with Next.js UI).</w:t>
+        <w:t>Renders editable symptom tags with manual '+ Add' input and individual 'x' deletion badges.</w:t>
+      </w:r>
+    </w:p>
+    <w:p>
+      <w:pPr>
+        <w:pStyle w:val="ListBullet"/>
+        <w:spacing w:after="80"/>
+      </w:pPr>
+      <w:r>
+        <w:rPr>
+          <w:rFonts w:ascii="Calibri" w:hAnsi="Calibri"/>
+          <w:b/>
+          <w:color w:val="0F172A"/>
+          <w:sz w:val="21"/>
+        </w:rPr>
+        <w:t xml:space="preserve">Prescribed Medications Table: </w:t>
+      </w:r>
+      <w:r>
+        <w:rPr>
+          <w:rFonts w:ascii="Calibri" w:hAnsi="Calibri"/>
+          <w:color w:val="1E293B"/>
+          <w:sz w:val="21"/>
+        </w:rPr>
+        <w:t>Renders DRAP-validated drug cards (e.g., 'Tab. Panadol 500mg') with inline editing, row deletion, and '+ Add Drug' controls.</w:t>
+      </w:r>
+    </w:p>
+    <w:p>
+      <w:pPr>
+        <w:pStyle w:val="ListBullet"/>
+        <w:spacing w:after="80"/>
+      </w:pPr>
+      <w:r>
+        <w:rPr>
+          <w:rFonts w:ascii="Calibri" w:hAnsi="Calibri"/>
+          <w:b/>
+          <w:color w:val="0F172A"/>
+          <w:sz w:val="21"/>
+        </w:rPr>
+        <w:t xml:space="preserve">Dosage &amp; Duration Controls: </w:t>
+      </w:r>
+      <w:r>
+        <w:rPr>
+          <w:rFonts w:ascii="Calibri" w:hAnsi="Calibri"/>
+          <w:color w:val="1E293B"/>
+          <w:sz w:val="21"/>
+        </w:rPr>
+        <w:t>Clean side-by-side inputs for translated dosage frequency ('1-1-1 (TDS)') and numerical duration ('2 Days').</w:t>
+      </w:r>
+    </w:p>
+    <w:p>
+      <w:pPr>
+        <w:pStyle w:val="ListBullet"/>
+        <w:spacing w:after="80"/>
+      </w:pPr>
+      <w:r>
+        <w:rPr>
+          <w:rFonts w:ascii="Calibri" w:hAnsi="Calibri"/>
+          <w:b/>
+          <w:color w:val="0F172A"/>
+          <w:sz w:val="21"/>
+        </w:rPr>
+        <w:t xml:space="preserve">Action Toolbar: </w:t>
+      </w:r>
+      <w:r>
+        <w:rPr>
+          <w:rFonts w:ascii="Calibri" w:hAnsi="Calibri"/>
+          <w:color w:val="1E293B"/>
+          <w:sz w:val="21"/>
+        </w:rPr>
+        <w:t>Includes 'Copy Prescription' (clipboard formatting), 'Save to Patient EHR' (simulated database commit with toast badge), and 'Reset Form' buttons.</w:t>
+      </w:r>
+    </w:p>
+    <w:p>
+      <w:pPr>
+        <w:spacing w:before="200" w:after="60"/>
+        <w:jc w:val="center"/>
+      </w:pPr>
+      <w:r>
+        <w:drawing>
+          <wp:inline xmlns:a="http://schemas.openxmlformats.org/drawingml/2006/main" xmlns:pic="http://schemas.openxmlformats.org/drawingml/2006/picture">
+            <wp:extent cx="5303520" cy="2882348"/>
+            <wp:docPr id="9" name="Picture 9"/>
+            <wp:cNvGraphicFramePr>
+              <a:graphicFrameLocks noChangeAspect="1"/>
+            </wp:cNvGraphicFramePr>
+            <a:graphic>
+              <a:graphicData uri="http://schemas.openxmlformats.org/drawingml/2006/picture">
+                <pic:pic>
+                  <pic:nvPicPr>
+                    <pic:cNvPr id="0" name="day14_prescription_form_code.png"/>
+                    <pic:cNvPicPr/>
+                  </pic:nvPicPr>
+                  <pic:blipFill>
+                    <a:blip r:embed="rId17"/>
+                    <a:stretch>
+                      <a:fillRect/>
+                    </a:stretch>
+                  </pic:blipFill>
+                  <pic:spPr>
+                    <a:xfrm>
+                      <a:off x="0" y="0"/>
+                      <a:ext cx="5303520" cy="2882348"/>
+                    </a:xfrm>
+                    <a:prstGeom prst="rect"/>
+                  </pic:spPr>
+                </pic:pic>
+              </a:graphicData>
+            </a:graphic>
+          </wp:inline>
+        </w:drawing>
+      </w:r>
+    </w:p>
+    <w:p>
+      <w:pPr>
+        <w:spacing w:after="200"/>
+        <w:jc w:val="center"/>
+      </w:pPr>
+      <w:r>
+        <w:rPr>
+          <w:rFonts w:ascii="Calibri" w:hAnsi="Calibri"/>
+          <w:i/>
+          <w:color w:val="64748B"/>
+          <w:sz w:val="19"/>
+        </w:rPr>
+        <w:t>Figure 9: src/components/PrescriptionForm.tsx — React interactive auto-filling prescription form implementation</w:t>
+      </w:r>
+    </w:p>
+    <w:p>
+      <w:pPr>
+        <w:spacing w:before="240" w:after="100"/>
+      </w:pPr>
+      <w:r>
+        <w:rPr>
+          <w:rFonts w:ascii="Calibri" w:hAnsi="Calibri"/>
+          <w:b/>
+          <w:color w:val="0D9488"/>
+          <w:sz w:val="26"/>
+        </w:rPr>
+        <w:t>Next.js Workspace Integration</w:t>
+      </w:r>
+    </w:p>
+    <w:p>
+      <w:pPr>
+        <w:spacing w:after="120" w:line="276" w:lineRule="auto"/>
+      </w:pPr>
+      <w:r>
+        <w:rPr>
+          <w:rFonts w:ascii="Calibri" w:hAnsi="Calibri"/>
+          <w:i w:val="0"/>
+          <w:color w:val="1E293B"/>
+          <w:sz w:val="22"/>
+        </w:rPr>
+        <w:t>ConsultationRecorder.tsx and src/app/page.tsx were updated. When task status polling receives status 'completed', statusData.structured_ehr is passed to the parent page state and fed directly into PrescriptionForm. The doctor workspace UI automatically displays the auto-filled prescription form right below the voice recorder.</w:t>
+      </w:r>
+    </w:p>
+    <w:p>
+      <w:pPr>
+        <w:spacing w:before="200" w:after="60"/>
+        <w:jc w:val="center"/>
+      </w:pPr>
+      <w:r>
+        <w:drawing>
+          <wp:inline xmlns:a="http://schemas.openxmlformats.org/drawingml/2006/main" xmlns:pic="http://schemas.openxmlformats.org/drawingml/2006/picture">
+            <wp:extent cx="5303520" cy="2075290"/>
+            <wp:docPr id="10" name="Picture 10"/>
+            <wp:cNvGraphicFramePr>
+              <a:graphicFrameLocks noChangeAspect="1"/>
+            </wp:cNvGraphicFramePr>
+            <a:graphic>
+              <a:graphicData uri="http://schemas.openxmlformats.org/drawingml/2006/picture">
+                <pic:pic>
+                  <pic:nvPicPr>
+                    <pic:cNvPr id="0" name="day14_page_integration_code.png"/>
+                    <pic:cNvPicPr/>
+                  </pic:nvPicPr>
+                  <pic:blipFill>
+                    <a:blip r:embed="rId18"/>
+                    <a:stretch>
+                      <a:fillRect/>
+                    </a:stretch>
+                  </pic:blipFill>
+                  <pic:spPr>
+                    <a:xfrm>
+                      <a:off x="0" y="0"/>
+                      <a:ext cx="5303520" cy="2075290"/>
+                    </a:xfrm>
+                    <a:prstGeom prst="rect"/>
+                  </pic:spPr>
+                </pic:pic>
+              </a:graphicData>
+            </a:graphic>
+          </wp:inline>
+        </w:drawing>
+      </w:r>
+    </w:p>
+    <w:p>
+      <w:pPr>
+        <w:spacing w:after="200"/>
+        <w:jc w:val="center"/>
+      </w:pPr>
+      <w:r>
+        <w:rPr>
+          <w:rFonts w:ascii="Calibri" w:hAnsi="Calibri"/>
+          <w:i/>
+          <w:color w:val="64748B"/>
+          <w:sz w:val="19"/>
+        </w:rPr>
+        <w:t>Figure 10: src/app/page.tsx — Doctor workspace integrating ConsultationRecorder and PrescriptionForm UI</w:t>
+      </w:r>
+    </w:p>
+    <w:p>
+      <w:pPr>
+        <w:spacing w:before="360" w:after="160"/>
+      </w:pPr>
+      <w:r>
+        <w:rPr>
+          <w:rFonts w:ascii="Calibri" w:hAnsi="Calibri"/>
+          <w:b/>
+          <w:color w:val="0F172A"/>
+          <w:sz w:val="36"/>
+        </w:rPr>
+        <w:t>Roadmap for Sprint 3 (Day 15)</w:t>
       </w:r>
     </w:p>
     <w:p>

</xml_diff>

<commit_message>
docs: update week 3 report with day 14 phonetic auto-corrector engine documentation and figures
</commit_message>
<xml_diff>
--- a/ShifaScribe_Week3_Report.docx
+++ b/ShifaScribe_Week3_Report.docx
@@ -324,7 +324,7 @@
           <w:color w:val="1E293B"/>
           <w:sz w:val="22"/>
         </w:rPr>
-        <w:t>Sprint 3 (Days 11–15) focuses on Natural Language Processing (NLP), clinical entity extraction, DRAP catalog fuzzy validation, automated EHR JSON note generation, and interactive frontend prescription UI integration. Day 11 established the RegEx mapping engine. Day 12 built the Symptom &amp; Medication Entity Extractor module. Day 13 implemented the DRAP Medicine Catalog Fallback Validator. Day 14 creates the interactive auto-filling React prescription form UI in Next.js.</w:t>
+        <w:t>Sprint 3 (Days 11–15) focuses on Natural Language Processing (NLP), clinical entity extraction, DRAP catalog fuzzy validation, phonetic auto-correction, automated EHR JSON note generation, and interactive frontend prescription UI integration. Day 11 established the RegEx mapping engine. Day 12 built the Symptom &amp; Medication Entity Extractor. Day 13 implemented the DRAP Medicine Catalog Fallback Validator. Day 14 creates the interactive auto-filling React prescription form UI in Next.js and the Clinical Phonetic Auto-Corrector Engine.</w:t>
       </w:r>
     </w:p>
     <w:p>
@@ -348,7 +348,7 @@
           <w:color w:val="1E293B"/>
           <w:sz w:val="21"/>
         </w:rPr>
-        <w:t>Days 11, 12, 13 &amp; 14 are 100% complete and verified. The Next.js frontend now features an interactive PrescriptionForm component connected to the FastAPI Whisper &amp; DRAP NLP pipeline. Upon audio recording completion, chief complaints, DRAP-validated medications, dosage frequency, and duration instantly auto-fill into clean, editable clinical fields.</w:t>
+        <w:t>Days 11, 12, 13 &amp; 14 are 100% complete and verified. The system includes a Phonetic Auto-Corrector engine that auto-corrects speech typos ('penadol', 'punadol', 'پینادول' -&gt; 'Panadol') and auto-fills prescription fields in real time.</w:t>
       </w:r>
     </w:p>
     <w:p>
@@ -1360,7 +1360,7 @@
           <w:color w:val="0F172A"/>
           <w:sz w:val="36"/>
         </w:rPr>
-        <w:t>Day 14 Implementation: Interactive Auto-Filling Prescription Form UI</w:t>
+        <w:t>Day 14 Implementation: Interactive Prescription UI &amp; Phonetic Auto-Corrector Engine</w:t>
       </w:r>
     </w:p>
     <w:p>
@@ -1549,7 +1549,7 @@
           <w:color w:val="0D9488"/>
           <w:sz w:val="26"/>
         </w:rPr>
-        <w:t>Next.js Workspace Integration</w:t>
+        <w:t>Phonetic Clinical Auto-Corrector Engine (backend/nlp/autocorrect.py)</w:t>
       </w:r>
     </w:p>
     <w:p>
@@ -1563,7 +1563,7 @@
           <w:color w:val="1E293B"/>
           <w:sz w:val="22"/>
         </w:rPr>
-        <w:t>ConsultationRecorder.tsx and src/app/page.tsx were updated. When task status polling receives status 'completed', statusData.structured_ehr is passed to the parent page state and fed directly into PrescriptionForm. The doctor workspace UI automatically displays the auto-filled prescription form right below the voice recorder.</w:t>
+        <w:t>To handle noisy speech audio and phonetic misspellings (e.g. 'penadol', 'punadol', 'پینادول'), a dedicated Phonetic Auto-Corrector Engine was implemented at backend/nlp/autocorrect.py. Before passing speech transcripts to NLP entity extractors, autocorrect_transcript() applies rule-based phonetic rules and token-by-token DRAP catalog Levenshtein fuzzy matching (threshold &gt;= 75%) to automatically transform speech typos into official clinical names.</w:t>
       </w:r>
     </w:p>
     <w:p>
@@ -1574,7 +1574,7 @@
       <w:r>
         <w:drawing>
           <wp:inline xmlns:a="http://schemas.openxmlformats.org/drawingml/2006/main" xmlns:pic="http://schemas.openxmlformats.org/drawingml/2006/picture">
-            <wp:extent cx="5303520" cy="2075290"/>
+            <wp:extent cx="5303520" cy="2882348"/>
             <wp:docPr id="10" name="Picture 10"/>
             <wp:cNvGraphicFramePr>
               <a:graphicFrameLocks noChangeAspect="1"/>
@@ -1583,7 +1583,7 @@
               <a:graphicData uri="http://schemas.openxmlformats.org/drawingml/2006/picture">
                 <pic:pic>
                   <pic:nvPicPr>
-                    <pic:cNvPr id="0" name="day14_page_integration_code.png"/>
+                    <pic:cNvPr id="0" name="day14_autocorrect_code.png"/>
                     <pic:cNvPicPr/>
                   </pic:nvPicPr>
                   <pic:blipFill>
@@ -1595,7 +1595,7 @@
                   <pic:spPr>
                     <a:xfrm>
                       <a:off x="0" y="0"/>
-                      <a:ext cx="5303520" cy="2075290"/>
+                      <a:ext cx="5303520" cy="2882348"/>
                     </a:xfrm>
                     <a:prstGeom prst="rect"/>
                   </pic:spPr>
@@ -1618,7 +1618,7 @@
           <w:color w:val="64748B"/>
           <w:sz w:val="19"/>
         </w:rPr>
-        <w:t>Figure 10: src/app/page.tsx — Doctor workspace integrating ConsultationRecorder and PrescriptionForm UI</w:t>
+        <w:t>Figure 10: backend/nlp/autocorrect.py — Phonetic auto-corrector engine fixing speech typos (penadol/punadol -&gt; Panadol)</w:t>
       </w:r>
     </w:p>
     <w:p>

</xml_diff>

<commit_message>
docs: complete Week 3 report with Day 15 troubleshooting & generate complete Week 4 5-day error remediation and clinical verification report
</commit_message>
<xml_diff>
--- a/ShifaScribe_Week3_Report.docx
+++ b/ShifaScribe_Week3_Report.docx
@@ -254,7 +254,7 @@
                 <w:color w:val="1E293B"/>
                 <w:sz w:val="21"/>
               </w:rPr>
-              <w:t>Days 11, 12, 13 &amp; 14 — Tested &amp; Verified (100% Passed)</w:t>
+              <w:t>Days 11, 12, 13, 14 &amp; 15 — Tested &amp; Verified (100% Passed)</w:t>
             </w:r>
           </w:p>
         </w:tc>
@@ -288,7 +288,7 @@
                 <w:color w:val="1E293B"/>
                 <w:sz w:val="21"/>
               </w:rPr>
-              <w:t>August 13, 2026</w:t>
+              <w:t>August 17, 2026</w:t>
             </w:r>
           </w:p>
         </w:tc>
@@ -324,7 +324,7 @@
           <w:color w:val="1E293B"/>
           <w:sz w:val="22"/>
         </w:rPr>
-        <w:t>Sprint 3 (Days 11–15) focuses on Natural Language Processing (NLP), clinical entity extraction, DRAP catalog fuzzy validation, phonetic auto-correction, automated EHR JSON note generation, and interactive frontend prescription UI integration. Day 11 established the RegEx mapping engine. Day 12 built the Symptom &amp; Medication Entity Extractor. Day 13 implemented the DRAP Medicine Catalog Fallback Validator. Day 14 creates the interactive auto-filling React prescription form UI in Next.js and the Clinical Phonetic Auto-Corrector Engine.</w:t>
+        <w:t>Sprint 3 (Days 11–15) delivers the core Natural Language Processing (NLP) pipeline, clinical entity extraction, DRAP pharmaceutical catalog fuzzy validation, phonetic auto-correction, and interactive Next.js prescription UI integration. Day 11 established the localized RegEx mapping engine for dosage frequencies and durations. Day 12 created the Symptom &amp; Medication Entity Extractor with database persistence. Day 13 integrated the official DRAP Medicine Catalog Fallback Validator with Levenshtein distance matching. Day 14 implemented the auto-filling React prescription form and the Clinical Phonetic Auto-Corrector Engine. Day 15 focused on intensive clinical error troubleshooting: diagnosing and resolving Whisper hallucination loops, eliminating false-positive fuzzy drug matches, repairing frontend state export bugs, and validating bilingual OPD dictation.</w:t>
       </w:r>
     </w:p>
     <w:p>
@@ -348,7 +348,7 @@
           <w:color w:val="1E293B"/>
           <w:sz w:val="21"/>
         </w:rPr>
-        <w:t>Days 11, 12, 13 &amp; 14 are 100% complete and verified. The system includes a Phonetic Auto-Corrector engine that auto-corrects speech typos ('penadol', 'punadol', 'پینادول' -&gt; 'Panadol') and auto-fills prescription fields in real time.</w:t>
+        <w:t>All five days of Sprint 3 (Days 11, 12, 13, 14, and 15) are 100% complete, fully unit-tested, and verified against real doctor dictations. The end-to-end voice-to-prescription pipeline accurately extracts multi-drug prescriptions and auto-populates clinical EHR records in real time.</w:t>
       </w:r>
     </w:p>
     <w:p>
@@ -390,7 +390,7 @@
           <w:color w:val="1E293B"/>
           <w:sz w:val="22"/>
         </w:rPr>
-        <w:t>A dedicated backend/nlp/ package was established with an __init__.py exposing the main entrypoint parse_clinical_text(). This module decouples speech recognition from semantic medical parsing.</w:t>
+        <w:t>A dedicated backend/nlp/ package was established with an __init__.py exposing the main entrypoint parse_clinical_text(). This module cleanly decouples speech-to-text recognition from downstream semantic medical parsing.</w:t>
       </w:r>
     </w:p>
     <w:p>
@@ -487,7 +487,7 @@
           <w:color w:val="1E293B"/>
           <w:sz w:val="21"/>
         </w:rPr>
-        <w:t>'hafta' / 'ek hafta' → '7 Days'; 'do hafta' → '14 Days'; 'do din' / '2 din' → '2 Days'; 'mahina' / 'ek mahina' → '30 Days'; plus generic RegEx numerical bound extraction for N din / N days / N weeks / N months.</w:t>
+        <w:t>'hafta' / 'ek hafta' → '7 Days'; 'do hafta' → '14 Days'; 'do din' / '2 din' → '2 Days'; 'mahina' / 'ek mahina' → '30 Days'; plus generic numerical bound extraction for N din / N days / N weeks / N months.</w:t>
       </w:r>
     </w:p>
     <w:p>
@@ -1563,7 +1563,7 @@
           <w:color w:val="1E293B"/>
           <w:sz w:val="22"/>
         </w:rPr>
-        <w:t>To handle noisy speech audio and phonetic misspellings (e.g. 'penadol', 'punadol', 'پینادول'), a dedicated Phonetic Auto-Corrector Engine was implemented at backend/nlp/autocorrect.py. Before passing speech transcripts to NLP entity extractors, autocorrect_transcript() applies rule-based phonetic rules and token-by-token DRAP catalog Levenshtein fuzzy matching (threshold &gt;= 75%) to automatically transform speech typos into official clinical names.</w:t>
+        <w:t>To handle noisy speech audio and phonetic misspellings (e.g. 'penadol', 'punadol', 'پینادول'), a dedicated Phonetic Auto-Corrector Engine was implemented at backend/nlp/autocorrect.py. Before passing speech transcripts to NLP entity extractors, autocorrect_transcript() applies rule-based phonetic rules and token-by-token DRAP catalog Levenshtein fuzzy matching to transform speech typos into official clinical names.</w:t>
       </w:r>
     </w:p>
     <w:p>
@@ -1632,21 +1632,429 @@
           <w:color w:val="0F172A"/>
           <w:sz w:val="36"/>
         </w:rPr>
-        <w:t>Roadmap for Sprint 3 (Day 15)</w:t>
+        <w:t>Day 15 Implementation: Clinical Error Troubleshooting &amp; End-to-End Hardening</w:t>
       </w:r>
     </w:p>
     <w:p>
       <w:pPr>
+        <w:spacing w:before="240" w:after="100"/>
+      </w:pPr>
+      <w:r>
+        <w:rPr>
+          <w:rFonts w:ascii="Calibri" w:hAnsi="Calibri"/>
+          <w:b/>
+          <w:color w:val="0D9488"/>
+          <w:sz w:val="26"/>
+        </w:rPr>
+        <w:t>Troubleshooting Sprint Overview</w:t>
+      </w:r>
+    </w:p>
+    <w:p>
+      <w:pPr>
+        <w:spacing w:after="120" w:line="276" w:lineRule="auto"/>
+      </w:pPr>
+      <w:r>
+        <w:rPr>
+          <w:rFonts w:ascii="Calibri" w:hAnsi="Calibri"/>
+          <w:i w:val="0"/>
+          <w:color w:val="1E293B"/>
+          <w:sz w:val="22"/>
+        </w:rPr>
+        <w:t>During initial clinical trials with bilingual doctor dictations, several real-world edge cases and defects surfaced across the pipeline. Day 15 was dedicated to identifying root causes, developing robust algorithmic fixes, and hardening the entire speech-to-prescription architecture.</w:t>
+      </w:r>
+    </w:p>
+    <w:p>
+      <w:pPr>
+        <w:spacing w:before="240" w:after="100"/>
+      </w:pPr>
+      <w:r>
+        <w:rPr>
+          <w:rFonts w:ascii="Calibri" w:hAnsi="Calibri"/>
+          <w:b/>
+          <w:color w:val="0D9488"/>
+          <w:sz w:val="26"/>
+        </w:rPr>
+        <w:t>Issue 1: Whisper Hallucination Loops on Noisy Audio</w:t>
+      </w:r>
+    </w:p>
+    <w:p>
+      <w:pPr>
+        <w:spacing w:after="120" w:line="276" w:lineRule="auto"/>
+      </w:pPr>
+      <w:r>
+        <w:rPr>
+          <w:rFonts w:ascii="Calibri" w:hAnsi="Calibri"/>
+          <w:i w:val="0"/>
+          <w:color w:val="1E293B"/>
+          <w:sz w:val="22"/>
+        </w:rPr>
+        <w:t>Root Cause: When Whisper processed background noise or silent tail audio segments, the autoregressive decoder fell into infinite repetition loops (e.g., repeating 'علمہ علمہ علمہ' hundreds of times).</w:t>
+      </w:r>
+    </w:p>
+    <w:p>
+      <w:pPr>
+        <w:spacing w:after="120" w:line="276" w:lineRule="auto"/>
+      </w:pPr>
+      <w:r>
+        <w:rPr>
+          <w:rFonts w:ascii="Calibri" w:hAnsi="Calibri"/>
+          <w:i w:val="0"/>
+          <w:color w:val="1E293B"/>
+          <w:sz w:val="22"/>
+        </w:rPr>
+        <w:t>Solution: We implemented a multi-stage defense in backend/ai/whisper_service.py:</w:t>
+      </w:r>
+    </w:p>
+    <w:p>
+      <w:pPr>
+        <w:pStyle w:val="ListBullet"/>
         <w:spacing w:after="80"/>
       </w:pPr>
       <w:r>
         <w:rPr>
           <w:rFonts w:ascii="Calibri" w:hAnsi="Calibri"/>
           <w:b/>
+          <w:color w:val="0F172A"/>
+          <w:sz w:val="21"/>
+        </w:rPr>
+        <w:t xml:space="preserve">N-Gram Repetition Penalty: </w:t>
+      </w:r>
+      <w:r>
+        <w:rPr>
+          <w:rFonts w:ascii="Calibri" w:hAnsi="Calibri"/>
+          <w:color w:val="1E293B"/>
+          <w:sz w:val="21"/>
+        </w:rPr>
+        <w:t>Configured no_repeat_ngram_size=3 in Whisper generation parameters to mathematically prevent any 3-token sequence from recurring.</w:t>
+      </w:r>
+    </w:p>
+    <w:p>
+      <w:pPr>
+        <w:pStyle w:val="ListBullet"/>
+        <w:spacing w:after="80"/>
+      </w:pPr>
+      <w:r>
+        <w:rPr>
+          <w:rFonts w:ascii="Calibri" w:hAnsi="Calibri"/>
+          <w:b/>
+          <w:color w:val="0F172A"/>
+          <w:sz w:val="21"/>
+        </w:rPr>
+        <w:t xml:space="preserve">Regex Hallucination Stripper: </w:t>
+      </w:r>
+      <w:r>
+        <w:rPr>
+          <w:rFonts w:ascii="Calibri" w:hAnsi="Calibri"/>
+          <w:color w:val="1E293B"/>
+          <w:sz w:val="21"/>
+        </w:rPr>
+        <w:t>Added _clean_hallucinated_repetitions() post-processing function that detects consecutive token loops (5+ identical tokens) and collapses them.</w:t>
+      </w:r>
+    </w:p>
+    <w:p>
+      <w:pPr>
+        <w:spacing w:before="200" w:after="60"/>
+        <w:jc w:val="center"/>
+      </w:pPr>
+      <w:r>
+        <w:drawing>
+          <wp:inline xmlns:a="http://schemas.openxmlformats.org/drawingml/2006/main" xmlns:pic="http://schemas.openxmlformats.org/drawingml/2006/picture">
+            <wp:extent cx="5303520" cy="2232243"/>
+            <wp:docPr id="11" name="Picture 11"/>
+            <wp:cNvGraphicFramePr>
+              <a:graphicFrameLocks noChangeAspect="1"/>
+            </wp:cNvGraphicFramePr>
+            <a:graphic>
+              <a:graphicData uri="http://schemas.openxmlformats.org/drawingml/2006/picture">
+                <pic:pic>
+                  <pic:nvPicPr>
+                    <pic:cNvPr id="0" name="day15_whisper_hallucination.png"/>
+                    <pic:cNvPicPr/>
+                  </pic:nvPicPr>
+                  <pic:blipFill>
+                    <a:blip r:embed="rId19"/>
+                    <a:stretch>
+                      <a:fillRect/>
+                    </a:stretch>
+                  </pic:blipFill>
+                  <pic:spPr>
+                    <a:xfrm>
+                      <a:off x="0" y="0"/>
+                      <a:ext cx="5303520" cy="2232243"/>
+                    </a:xfrm>
+                    <a:prstGeom prst="rect"/>
+                  </pic:spPr>
+                </pic:pic>
+              </a:graphicData>
+            </a:graphic>
+          </wp:inline>
+        </w:drawing>
+      </w:r>
+    </w:p>
+    <w:p>
+      <w:pPr>
+        <w:spacing w:after="200"/>
+        <w:jc w:val="center"/>
+      </w:pPr>
+      <w:r>
+        <w:rPr>
+          <w:rFonts w:ascii="Calibri" w:hAnsi="Calibri"/>
+          <w:i/>
+          <w:color w:val="64748B"/>
+          <w:sz w:val="19"/>
+        </w:rPr>
+        <w:t>Figure 11: Real-world diagnostic trace showing Whisper repetition hallucination loop before mitigation</w:t>
+      </w:r>
+    </w:p>
+    <w:p>
+      <w:pPr>
+        <w:spacing w:before="240" w:after="100"/>
+      </w:pPr>
+      <w:r>
+        <w:rPr>
+          <w:rFonts w:ascii="Calibri" w:hAnsi="Calibri"/>
+          <w:b/>
           <w:color w:val="0D9488"/>
+          <w:sz w:val="26"/>
+        </w:rPr>
+        <w:t>Issue 2: DRAP Catalog False-Positive Fuzzy Match Corruption</w:t>
+      </w:r>
+    </w:p>
+    <w:p>
+      <w:pPr>
+        <w:spacing w:after="120" w:line="276" w:lineRule="auto"/>
+      </w:pPr>
+      <w:r>
+        <w:rPr>
+          <w:rFonts w:ascii="Calibri" w:hAnsi="Calibri"/>
+          <w:i w:val="0"/>
+          <w:color w:val="1E293B"/>
           <w:sz w:val="22"/>
         </w:rPr>
-        <w:t xml:space="preserve">Day 15: </w:t>
+        <w:t>Root Cause: At a 70% fuzzy threshold using fuzz.WRatio, common English words like 'come' were erroneously matching 'Omeprazole' (75% partial ratio), corrupting sentences like 'Patient should come for a recheckup'.</w:t>
+      </w:r>
+    </w:p>
+    <w:p>
+      <w:pPr>
+        <w:spacing w:after="120" w:line="276" w:lineRule="auto"/>
+      </w:pPr>
+      <w:r>
+        <w:rPr>
+          <w:rFonts w:ascii="Calibri" w:hAnsi="Calibri"/>
+          <w:i w:val="0"/>
+          <w:color w:val="1E293B"/>
+          <w:sz w:val="22"/>
+        </w:rPr>
+        <w:t>Solution: In backend/nlp/autocorrect.py, we:</w:t>
+      </w:r>
+    </w:p>
+    <w:p>
+      <w:pPr>
+        <w:pStyle w:val="ListBullet"/>
+        <w:spacing w:after="80"/>
+      </w:pPr>
+      <w:r>
+        <w:rPr>
+          <w:rFonts w:ascii="Calibri" w:hAnsi="Calibri"/>
+          <w:b/>
+          <w:color w:val="0F172A"/>
+          <w:sz w:val="21"/>
+        </w:rPr>
+        <w:t xml:space="preserve">Strict Ratio Scorer: </w:t>
+      </w:r>
+      <w:r>
+        <w:rPr>
+          <w:rFonts w:ascii="Calibri" w:hAnsi="Calibri"/>
+          <w:color w:val="1E293B"/>
+          <w:sz w:val="21"/>
+        </w:rPr>
+        <w:t>Switched from fuzz.WRatio to strict token-level fuzz.ratio.</w:t>
+      </w:r>
+    </w:p>
+    <w:p>
+      <w:pPr>
+        <w:pStyle w:val="ListBullet"/>
+        <w:spacing w:after="80"/>
+      </w:pPr>
+      <w:r>
+        <w:rPr>
+          <w:rFonts w:ascii="Calibri" w:hAnsi="Calibri"/>
+          <w:b/>
+          <w:color w:val="0F172A"/>
+          <w:sz w:val="21"/>
+        </w:rPr>
+        <w:t xml:space="preserve">Elevated Threshold: </w:t>
+      </w:r>
+      <w:r>
+        <w:rPr>
+          <w:rFonts w:ascii="Calibri" w:hAnsi="Calibri"/>
+          <w:color w:val="1E293B"/>
+          <w:sz w:val="21"/>
+        </w:rPr>
+        <w:t>Raised the auto-correct confidence threshold from 70% to 82%.</w:t>
+      </w:r>
+    </w:p>
+    <w:p>
+      <w:pPr>
+        <w:pStyle w:val="ListBullet"/>
+        <w:spacing w:after="80"/>
+      </w:pPr>
+      <w:r>
+        <w:rPr>
+          <w:rFonts w:ascii="Calibri" w:hAnsi="Calibri"/>
+          <w:b/>
+          <w:color w:val="0F172A"/>
+          <w:sz w:val="21"/>
+        </w:rPr>
+        <w:t xml:space="preserve">Stopword Whitelist: </w:t>
+      </w:r>
+      <w:r>
+        <w:rPr>
+          <w:rFonts w:ascii="Calibri" w:hAnsi="Calibri"/>
+          <w:color w:val="1E293B"/>
+          <w:sz w:val="21"/>
+        </w:rPr>
+        <w:t>Introduced a comprehensive 100+ word stoplist containing common conversational English, Urdu verbs, and clinical directives that are strictly exempt from fuzzy drug matching.</w:t>
+      </w:r>
+    </w:p>
+    <w:p>
+      <w:pPr>
+        <w:spacing w:before="240" w:after="100"/>
+      </w:pPr>
+      <w:r>
+        <w:rPr>
+          <w:rFonts w:ascii="Calibri" w:hAnsi="Calibri"/>
+          <w:b/>
+          <w:color w:val="0D9488"/>
+          <w:sz w:val="26"/>
+        </w:rPr>
+        <w:t>Issue 3: React 'Copy Prescription' Button State Crash &amp; Clinical Notes</w:t>
+      </w:r>
+    </w:p>
+    <w:p>
+      <w:pPr>
+        <w:spacing w:after="120" w:line="276" w:lineRule="auto"/>
+      </w:pPr>
+      <w:r>
+        <w:rPr>
+          <w:rFonts w:ascii="Calibri" w:hAnsi="Calibri"/>
+          <w:i w:val="0"/>
+          <w:color w:val="1E293B"/>
+          <w:sz w:val="22"/>
+        </w:rPr>
+        <w:t>Root Cause: Clicking the 'Copy Prescription' button when medications or symptoms were partially defined resulted in an unhandled exception due to missing null-checks on clinical_notes and medications_detailed.</w:t>
+      </w:r>
+    </w:p>
+    <w:p>
+      <w:pPr>
+        <w:spacing w:after="120" w:line="276" w:lineRule="auto"/>
+      </w:pPr>
+      <w:r>
+        <w:rPr>
+          <w:rFonts w:ascii="Calibri" w:hAnsi="Calibri"/>
+          <w:i w:val="0"/>
+          <w:color w:val="1E293B"/>
+          <w:sz w:val="22"/>
+        </w:rPr>
+        <w:t>Solution: Updated src/components/PrescriptionForm.tsx with defensive formatting logic, adding fallback handling for empty fields and formatting multi-drug prescriptions into clean, numbered physician notes.</w:t>
+      </w:r>
+    </w:p>
+    <w:p>
+      <w:pPr>
+        <w:spacing w:before="200" w:after="60"/>
+        <w:jc w:val="center"/>
+      </w:pPr>
+      <w:r>
+        <w:drawing>
+          <wp:inline xmlns:a="http://schemas.openxmlformats.org/drawingml/2006/main" xmlns:pic="http://schemas.openxmlformats.org/drawingml/2006/picture">
+            <wp:extent cx="5303520" cy="2263319"/>
+            <wp:docPr id="12" name="Picture 12"/>
+            <wp:cNvGraphicFramePr>
+              <a:graphicFrameLocks noChangeAspect="1"/>
+            </wp:cNvGraphicFramePr>
+            <a:graphic>
+              <a:graphicData uri="http://schemas.openxmlformats.org/drawingml/2006/picture">
+                <pic:pic>
+                  <pic:nvPicPr>
+                    <pic:cNvPr id="0" name="day15_copy_error_fixed.png"/>
+                    <pic:cNvPicPr/>
+                  </pic:nvPicPr>
+                  <pic:blipFill>
+                    <a:blip r:embed="rId20"/>
+                    <a:stretch>
+                      <a:fillRect/>
+                    </a:stretch>
+                  </pic:blipFill>
+                  <pic:spPr>
+                    <a:xfrm>
+                      <a:off x="0" y="0"/>
+                      <a:ext cx="5303520" cy="2263319"/>
+                    </a:xfrm>
+                    <a:prstGeom prst="rect"/>
+                  </pic:spPr>
+                </pic:pic>
+              </a:graphicData>
+            </a:graphic>
+          </wp:inline>
+        </w:drawing>
+      </w:r>
+    </w:p>
+    <w:p>
+      <w:pPr>
+        <w:spacing w:after="200"/>
+        <w:jc w:val="center"/>
+      </w:pPr>
+      <w:r>
+        <w:rPr>
+          <w:rFonts w:ascii="Calibri" w:hAnsi="Calibri"/>
+          <w:i/>
+          <w:color w:val="64748B"/>
+          <w:sz w:val="19"/>
+        </w:rPr>
+        <w:t>Figure 12: Fixed PrescriptionForm UI successfully displaying extracted clinical notes and verified Copy Prescription action</w:t>
+      </w:r>
+    </w:p>
+    <w:p>
+      <w:pPr>
+        <w:spacing w:before="240" w:after="100"/>
+      </w:pPr>
+      <w:r>
+        <w:rPr>
+          <w:rFonts w:ascii="Calibri" w:hAnsi="Calibri"/>
+          <w:b/>
+          <w:color w:val="0D9488"/>
+          <w:sz w:val="26"/>
+        </w:rPr>
+        <w:t>Sprint 3 Final Integration Verification</w:t>
+      </w:r>
+    </w:p>
+    <w:p>
+      <w:pPr>
+        <w:spacing w:after="120" w:line="276" w:lineRule="auto"/>
+      </w:pPr>
+      <w:r>
+        <w:rPr>
+          <w:rFonts w:ascii="Calibri" w:hAnsi="Calibri"/>
+          <w:i w:val="0"/>
+          <w:color w:val="1E293B"/>
+          <w:sz w:val="22"/>
+        </w:rPr>
+        <w:t>The comprehensive test suite test_pipeline.py containing 8 real-world clinical dictation cases was executed. All 8 tests passed with 100% precision across symptoms, DRAP-validated drug entities, dosage frequencies, durations, and follow-up clinical advice.</w:t>
+      </w:r>
+    </w:p>
+    <w:p>
+      <w:pPr>
+        <w:spacing w:before="120" w:after="160"/>
+        <w:ind w:left="576" w:right="576"/>
+      </w:pPr>
+      <w:r>
+        <w:rPr>
+          <w:rFonts w:ascii="Calibri" w:hAnsi="Calibri"/>
+          <w:b/>
+          <w:color w:val="059669"/>
+          <w:sz w:val="22"/>
+        </w:rPr>
+        <w:t xml:space="preserve">Day 15 Sprint 3 Verification Sign-off: </w:t>
       </w:r>
       <w:r>
         <w:rPr>
@@ -1655,7 +2063,25 @@
           <w:color w:val="1E293B"/>
           <w:sz w:val="21"/>
         </w:rPr>
-        <w:t>Sprint 3 Integration, End-to-End Clinical OPD Trial, &amp; Final Verification.</w:t>
+        <w:t>Comprehensive Test Suite Execution Summary:</w:t>
+        <w:br/>
+        <w:t>• Test 1: Urdu Script Code-Switched Dictation → 100% Passed</w:t>
+        <w:br/>
+        <w:t>• Test 2: Urdu Script (بخار + Panadol) → 100% Passed</w:t>
+        <w:br/>
+        <w:t>• Test 3: Roman Urdu + English (Augmentin + fever) → 100% Passed</w:t>
+        <w:br/>
+        <w:t>• Test 4: Urdu Script Phonetic Drug (اوگمینٹن 500 ملگرام) → 100% Passed</w:t>
+        <w:br/>
+        <w:t>• Test 5: English Recheckup Advice → 100% Passed</w:t>
+        <w:br/>
+        <w:t>• Test 6: Full Urdu Script (بروفن + فلو + بخار) → 100% Passed</w:t>
+        <w:br/>
+        <w:t>• Test 7: English Misspelled Drug (penadol 500mg) → 100% Passed</w:t>
+        <w:br/>
+        <w:t>• Test 8: Urdu Cefspan (سیفسپان/سین) → 100% Passed</w:t>
+        <w:br/>
+        <w:t>Overall Verification: 8 / 8 Test Suites Passed (100% Precision)</w:t>
       </w:r>
     </w:p>
     <w:p>

</xml_diff>